<commit_message>
refactor(mobile): remove redundant Menampilkan Daftar TCs (9.2, 14.2, 15.2) and renumber TCs across docs, scripts, and screenshot folders
</commit_message>
<xml_diff>
--- a/SIT/SIT BTN SMART Mobile.docx
+++ b/SIT/SIT BTN SMART Mobile.docx
@@ -16128,14 +16128,8 @@
             <w:vAlign w:val="center"/>
           </w:tcPr>
           <w:p>
-            <w:pPr>
-              <w:pStyle w:val="TableParagraph"/>
-              <w:spacing w:before="134"/>
-              <w:ind w:left="176" w:right="168"/>
-              <w:jc w:val="center"/>
-            </w:pPr>
-            <w:r>
-              <w:t xml:space="preserve">9.1</w:t>
+            <w:r>
+              <w:t>9.1</w:t>
             </w:r>
           </w:p>
         </w:tc>
@@ -16253,14 +16247,8 @@
             <w:vAlign w:val="center"/>
           </w:tcPr>
           <w:p>
-            <w:pPr>
-              <w:pStyle w:val="TableParagraph"/>
-              <w:spacing w:before="134"/>
-              <w:ind w:left="176" w:right="168"/>
-              <w:jc w:val="center"/>
-            </w:pPr>
-            <w:r>
-              <w:t xml:space="preserve">9.2</w:t>
+            <w:r>
+              <w:t>9.2</w:t>
             </w:r>
           </w:p>
         </w:tc>
@@ -16278,7 +16266,7 @@
               <w:jc w:val="center"/>
             </w:pPr>
             <w:r>
-              <w:t xml:space="preserve">Menampilkan daftar data pengajuan cuti</w:t>
+              <w:t xml:space="preserve">Mencari data pengajuan cuti dengan keyword valid</w:t>
             </w:r>
           </w:p>
         </w:tc>
@@ -16299,37 +16287,37 @@
               </w:rPr>
             </w:pPr>
             <w:r>
-              <w:t xml:space="preserve">Klik menu Lainnya pada navigation bar - Klik menu Cuti &amp; Izin</w:t>
-            </w:r>
-          </w:p>
-        </w:tc>
-        <w:tc>
-          <w:tcPr>
-            <w:tcW w:w="2833" w:type="dxa"/>
-            <w:vAlign w:val="center"/>
-          </w:tcPr>
-          <w:p>
-            <w:pPr>
-              <w:pStyle w:val="TableParagraph"/>
-              <w:jc w:val="center"/>
-            </w:pPr>
-            <w:r>
-              <w:t xml:space="preserve">Berhasil menampilkan daftar data pengajuan cuti.</w:t>
-            </w:r>
-          </w:p>
-        </w:tc>
-        <w:tc>
-          <w:tcPr>
-            <w:tcW w:w="2833" w:type="dxa"/>
-            <w:vAlign w:val="center"/>
-          </w:tcPr>
-          <w:p>
-            <w:pPr>
-              <w:pStyle w:val="TableParagraph"/>
-              <w:jc w:val="center"/>
-            </w:pPr>
-            <w:r>
-              <w:t xml:space="preserve">Berhasil menampilkan daftar data pengajuan cuti.</w:t>
+              <w:t xml:space="preserve">Masukkan keyword valid pada field Search - Klik button Search</w:t>
+            </w:r>
+          </w:p>
+        </w:tc>
+        <w:tc>
+          <w:tcPr>
+            <w:tcW w:w="2833" w:type="dxa"/>
+            <w:vAlign w:val="center"/>
+          </w:tcPr>
+          <w:p>
+            <w:pPr>
+              <w:pStyle w:val="TableParagraph"/>
+              <w:jc w:val="center"/>
+            </w:pPr>
+            <w:r>
+              <w:t xml:space="preserve">Berhasil menampilkan data pengajuan cuti sesuai keyword yang dicari.</w:t>
+            </w:r>
+          </w:p>
+        </w:tc>
+        <w:tc>
+          <w:tcPr>
+            <w:tcW w:w="2833" w:type="dxa"/>
+            <w:vAlign w:val="center"/>
+          </w:tcPr>
+          <w:p>
+            <w:pPr>
+              <w:pStyle w:val="TableParagraph"/>
+              <w:jc w:val="center"/>
+            </w:pPr>
+            <w:r>
+              <w:t xml:space="preserve">Berhasil menampilkan data pengajuan cuti sesuai keyword yang dicari.</w:t>
             </w:r>
           </w:p>
         </w:tc>
@@ -16378,14 +16366,8 @@
             <w:vAlign w:val="center"/>
           </w:tcPr>
           <w:p>
-            <w:pPr>
-              <w:pStyle w:val="TableParagraph"/>
-              <w:spacing w:before="134"/>
-              <w:ind w:left="176" w:right="168"/>
-              <w:jc w:val="center"/>
-            </w:pPr>
-            <w:r>
-              <w:t xml:space="preserve">9.3</w:t>
+            <w:r>
+              <w:t>9.3</w:t>
             </w:r>
           </w:p>
         </w:tc>
@@ -16403,7 +16385,7 @@
               <w:jc w:val="center"/>
             </w:pPr>
             <w:r>
-              <w:t xml:space="preserve">Mencari data pengajuan cuti dengan keyword valid</w:t>
+              <w:t xml:space="preserve">Mencari data pengajuan cuti dengan keyword tidak valid</w:t>
             </w:r>
           </w:p>
         </w:tc>
@@ -16424,37 +16406,37 @@
               </w:rPr>
             </w:pPr>
             <w:r>
-              <w:t xml:space="preserve">Masukkan keyword valid pada field Search - Klik button Search</w:t>
-            </w:r>
-          </w:p>
-        </w:tc>
-        <w:tc>
-          <w:tcPr>
-            <w:tcW w:w="2833" w:type="dxa"/>
-            <w:vAlign w:val="center"/>
-          </w:tcPr>
-          <w:p>
-            <w:pPr>
-              <w:pStyle w:val="TableParagraph"/>
-              <w:jc w:val="center"/>
-            </w:pPr>
-            <w:r>
-              <w:t xml:space="preserve">Berhasil menampilkan data pengajuan cuti sesuai keyword yang dicari.</w:t>
-            </w:r>
-          </w:p>
-        </w:tc>
-        <w:tc>
-          <w:tcPr>
-            <w:tcW w:w="2833" w:type="dxa"/>
-            <w:vAlign w:val="center"/>
-          </w:tcPr>
-          <w:p>
-            <w:pPr>
-              <w:pStyle w:val="TableParagraph"/>
-              <w:jc w:val="center"/>
-            </w:pPr>
-            <w:r>
-              <w:t xml:space="preserve">Berhasil menampilkan data pengajuan cuti sesuai keyword yang dicari.</w:t>
+              <w:t xml:space="preserve">Masukkan keyword tidak valid pada field Search - Klik button Search</w:t>
+            </w:r>
+          </w:p>
+        </w:tc>
+        <w:tc>
+          <w:tcPr>
+            <w:tcW w:w="2833" w:type="dxa"/>
+            <w:vAlign w:val="center"/>
+          </w:tcPr>
+          <w:p>
+            <w:pPr>
+              <w:pStyle w:val="TableParagraph"/>
+              <w:jc w:val="center"/>
+            </w:pPr>
+            <w:r>
+              <w:t xml:space="preserve">Menampilkan pesan data tidak ditemukan.</w:t>
+            </w:r>
+          </w:p>
+        </w:tc>
+        <w:tc>
+          <w:tcPr>
+            <w:tcW w:w="2833" w:type="dxa"/>
+            <w:vAlign w:val="center"/>
+          </w:tcPr>
+          <w:p>
+            <w:pPr>
+              <w:pStyle w:val="TableParagraph"/>
+              <w:jc w:val="center"/>
+            </w:pPr>
+            <w:r>
+              <w:t xml:space="preserve">Berhasil Menampilkan pesan data tidak ditemukan.</w:t>
             </w:r>
           </w:p>
         </w:tc>
@@ -16503,14 +16485,8 @@
             <w:vAlign w:val="center"/>
           </w:tcPr>
           <w:p>
-            <w:pPr>
-              <w:pStyle w:val="TableParagraph"/>
-              <w:spacing w:before="134"/>
-              <w:ind w:left="176" w:right="168"/>
-              <w:jc w:val="center"/>
-            </w:pPr>
-            <w:r>
-              <w:t xml:space="preserve">9.4</w:t>
+            <w:r>
+              <w:t>9.4</w:t>
             </w:r>
           </w:p>
         </w:tc>
@@ -16528,7 +16504,7 @@
               <w:jc w:val="center"/>
             </w:pPr>
             <w:r>
-              <w:t xml:space="preserve">Mencari data pengajuan cuti dengan keyword tidak valid</w:t>
+              <w:t xml:space="preserve">Melakukan filter data pengajuan cuti</w:t>
             </w:r>
           </w:p>
         </w:tc>
@@ -16549,37 +16525,37 @@
               </w:rPr>
             </w:pPr>
             <w:r>
-              <w:t xml:space="preserve">Masukkan keyword tidak valid pada field Search - Klik button Search</w:t>
-            </w:r>
-          </w:p>
-        </w:tc>
-        <w:tc>
-          <w:tcPr>
-            <w:tcW w:w="2833" w:type="dxa"/>
-            <w:vAlign w:val="center"/>
-          </w:tcPr>
-          <w:p>
-            <w:pPr>
-              <w:pStyle w:val="TableParagraph"/>
-              <w:jc w:val="center"/>
-            </w:pPr>
-            <w:r>
-              <w:t xml:space="preserve">Menampilkan pesan data tidak ditemukan.</w:t>
-            </w:r>
-          </w:p>
-        </w:tc>
-        <w:tc>
-          <w:tcPr>
-            <w:tcW w:w="2833" w:type="dxa"/>
-            <w:vAlign w:val="center"/>
-          </w:tcPr>
-          <w:p>
-            <w:pPr>
-              <w:pStyle w:val="TableParagraph"/>
-              <w:jc w:val="center"/>
-            </w:pPr>
-            <w:r>
-              <w:t xml:space="preserve">Berhasil Menampilkan pesan data tidak ditemukan.</w:t>
+              <w:t xml:space="preserve">Klik icon filter - Pilih rentang tanggal pada field Pilih Rentang Tanggal - Pilih urutan ASC atau DESC pada Urutkan Berdasarkan - Klik button Apply</w:t>
+            </w:r>
+          </w:p>
+        </w:tc>
+        <w:tc>
+          <w:tcPr>
+            <w:tcW w:w="2833" w:type="dxa"/>
+            <w:vAlign w:val="center"/>
+          </w:tcPr>
+          <w:p>
+            <w:pPr>
+              <w:pStyle w:val="TableParagraph"/>
+              <w:jc w:val="center"/>
+            </w:pPr>
+            <w:r>
+              <w:t xml:space="preserve">Berhasil menampilkan data pengajuan cuti sesuai filter yang dipilih.</w:t>
+            </w:r>
+          </w:p>
+        </w:tc>
+        <w:tc>
+          <w:tcPr>
+            <w:tcW w:w="2833" w:type="dxa"/>
+            <w:vAlign w:val="center"/>
+          </w:tcPr>
+          <w:p>
+            <w:pPr>
+              <w:pStyle w:val="TableParagraph"/>
+              <w:jc w:val="center"/>
+            </w:pPr>
+            <w:r>
+              <w:t xml:space="preserve">Berhasil menampilkan data pengajuan cuti sesuai filter yang dipilih.</w:t>
             </w:r>
           </w:p>
         </w:tc>
@@ -16628,14 +16604,8 @@
             <w:vAlign w:val="center"/>
           </w:tcPr>
           <w:p>
-            <w:pPr>
-              <w:pStyle w:val="TableParagraph"/>
-              <w:spacing w:before="134"/>
-              <w:ind w:left="176" w:right="168"/>
-              <w:jc w:val="center"/>
-            </w:pPr>
-            <w:r>
-              <w:t xml:space="preserve">9.5</w:t>
+            <w:r>
+              <w:t>9.5</w:t>
             </w:r>
           </w:p>
         </w:tc>
@@ -16653,7 +16623,7 @@
               <w:jc w:val="center"/>
             </w:pPr>
             <w:r>
-              <w:t xml:space="preserve">Melakukan filter data pengajuan cuti</w:t>
+              <w:t xml:space="preserve">Menampilkan data pengajuan cuti berdasarkan jenis cuti</w:t>
             </w:r>
           </w:p>
         </w:tc>
@@ -16674,37 +16644,37 @@
               </w:rPr>
             </w:pPr>
             <w:r>
-              <w:t xml:space="preserve">Klik icon filter - Pilih rentang tanggal pada field Pilih Rentang Tanggal - Pilih urutan ASC atau DESC pada Urutkan Berdasarkan - Klik button Apply</w:t>
-            </w:r>
-          </w:p>
-        </w:tc>
-        <w:tc>
-          <w:tcPr>
-            <w:tcW w:w="2833" w:type="dxa"/>
-            <w:vAlign w:val="center"/>
-          </w:tcPr>
-          <w:p>
-            <w:pPr>
-              <w:pStyle w:val="TableParagraph"/>
-              <w:jc w:val="center"/>
-            </w:pPr>
-            <w:r>
-              <w:t xml:space="preserve">Berhasil menampilkan data pengajuan cuti sesuai filter yang dipilih.</w:t>
-            </w:r>
-          </w:p>
-        </w:tc>
-        <w:tc>
-          <w:tcPr>
-            <w:tcW w:w="2833" w:type="dxa"/>
-            <w:vAlign w:val="center"/>
-          </w:tcPr>
-          <w:p>
-            <w:pPr>
-              <w:pStyle w:val="TableParagraph"/>
-              <w:jc w:val="center"/>
-            </w:pPr>
-            <w:r>
-              <w:t xml:space="preserve">Berhasil menampilkan data pengajuan cuti sesuai filter yang dipilih.</w:t>
+              <w:t xml:space="preserve">Klik salah satu card jenis cuti (Semua, Cuti Melahirkan, atau Cuti Menikah)</w:t>
+            </w:r>
+          </w:p>
+        </w:tc>
+        <w:tc>
+          <w:tcPr>
+            <w:tcW w:w="2833" w:type="dxa"/>
+            <w:vAlign w:val="center"/>
+          </w:tcPr>
+          <w:p>
+            <w:pPr>
+              <w:pStyle w:val="TableParagraph"/>
+              <w:jc w:val="center"/>
+            </w:pPr>
+            <w:r>
+              <w:t xml:space="preserve">Berhasil menampilkan data pengajuan cuti sesuai jenis cuti yang dipilih.</w:t>
+            </w:r>
+          </w:p>
+        </w:tc>
+        <w:tc>
+          <w:tcPr>
+            <w:tcW w:w="2833" w:type="dxa"/>
+            <w:vAlign w:val="center"/>
+          </w:tcPr>
+          <w:p>
+            <w:pPr>
+              <w:pStyle w:val="TableParagraph"/>
+              <w:jc w:val="center"/>
+            </w:pPr>
+            <w:r>
+              <w:t xml:space="preserve">Berhasil menampilkan data pengajuan cuti sesuai jenis cuti yang dipilih.</w:t>
             </w:r>
           </w:p>
         </w:tc>
@@ -16753,14 +16723,8 @@
             <w:vAlign w:val="center"/>
           </w:tcPr>
           <w:p>
-            <w:pPr>
-              <w:pStyle w:val="TableParagraph"/>
-              <w:spacing w:before="134"/>
-              <w:ind w:left="176" w:right="168"/>
-              <w:jc w:val="center"/>
-            </w:pPr>
-            <w:r>
-              <w:t xml:space="preserve">9.6</w:t>
+            <w:r>
+              <w:t>9.6</w:t>
             </w:r>
           </w:p>
         </w:tc>
@@ -16778,7 +16742,7 @@
               <w:jc w:val="center"/>
             </w:pPr>
             <w:r>
-              <w:t xml:space="preserve">Menampilkan data pengajuan cuti berdasarkan jenis cuti</w:t>
+              <w:t xml:space="preserve">Menampilkan data pengajuan cuti berdasarkan status</w:t>
             </w:r>
           </w:p>
         </w:tc>
@@ -16799,37 +16763,37 @@
               </w:rPr>
             </w:pPr>
             <w:r>
-              <w:t xml:space="preserve">Klik salah satu card jenis cuti (Semua, Cuti Melahirkan, atau Cuti Menikah)</w:t>
-            </w:r>
-          </w:p>
-        </w:tc>
-        <w:tc>
-          <w:tcPr>
-            <w:tcW w:w="2833" w:type="dxa"/>
-            <w:vAlign w:val="center"/>
-          </w:tcPr>
-          <w:p>
-            <w:pPr>
-              <w:pStyle w:val="TableParagraph"/>
-              <w:jc w:val="center"/>
-            </w:pPr>
-            <w:r>
-              <w:t xml:space="preserve">Berhasil menampilkan data pengajuan cuti sesuai jenis cuti yang dipilih.</w:t>
-            </w:r>
-          </w:p>
-        </w:tc>
-        <w:tc>
-          <w:tcPr>
-            <w:tcW w:w="2833" w:type="dxa"/>
-            <w:vAlign w:val="center"/>
-          </w:tcPr>
-          <w:p>
-            <w:pPr>
-              <w:pStyle w:val="TableParagraph"/>
-              <w:jc w:val="center"/>
-            </w:pPr>
-            <w:r>
-              <w:t xml:space="preserve">Berhasil menampilkan data pengajuan cuti sesuai jenis cuti yang dipilih.</w:t>
+              <w:t xml:space="preserve">Klik salah satu tab status (Semua, Ditolak, Pending, atau Disetujui)</w:t>
+            </w:r>
+          </w:p>
+        </w:tc>
+        <w:tc>
+          <w:tcPr>
+            <w:tcW w:w="2833" w:type="dxa"/>
+            <w:vAlign w:val="center"/>
+          </w:tcPr>
+          <w:p>
+            <w:pPr>
+              <w:pStyle w:val="TableParagraph"/>
+              <w:jc w:val="center"/>
+            </w:pPr>
+            <w:r>
+              <w:t xml:space="preserve">Berhasil menampilkan data pengajuan cuti sesuai status yang dipilih.</w:t>
+            </w:r>
+          </w:p>
+        </w:tc>
+        <w:tc>
+          <w:tcPr>
+            <w:tcW w:w="2833" w:type="dxa"/>
+            <w:vAlign w:val="center"/>
+          </w:tcPr>
+          <w:p>
+            <w:pPr>
+              <w:pStyle w:val="TableParagraph"/>
+              <w:jc w:val="center"/>
+            </w:pPr>
+            <w:r>
+              <w:t xml:space="preserve">Berhasil menampilkan data pengajuan cuti sesuai status yang dipilih.</w:t>
             </w:r>
           </w:p>
         </w:tc>
@@ -16878,14 +16842,8 @@
             <w:vAlign w:val="center"/>
           </w:tcPr>
           <w:p>
-            <w:pPr>
-              <w:pStyle w:val="TableParagraph"/>
-              <w:spacing w:before="134"/>
-              <w:ind w:left="176" w:right="168"/>
-              <w:jc w:val="center"/>
-            </w:pPr>
-            <w:r>
-              <w:t xml:space="preserve">9.7</w:t>
+            <w:r>
+              <w:t>9.7</w:t>
             </w:r>
           </w:p>
         </w:tc>
@@ -16903,7 +16861,7 @@
               <w:jc w:val="center"/>
             </w:pPr>
             <w:r>
-              <w:t xml:space="preserve">Menampilkan data pengajuan cuti berdasarkan status</w:t>
+              <w:t xml:space="preserve">Mengajukan cuti</w:t>
             </w:r>
           </w:p>
         </w:tc>
@@ -16924,37 +16882,37 @@
               </w:rPr>
             </w:pPr>
             <w:r>
-              <w:t xml:space="preserve">Klik salah satu tab status (Semua, Ditolak, Pending, atau Disetujui)</w:t>
-            </w:r>
-          </w:p>
-        </w:tc>
-        <w:tc>
-          <w:tcPr>
-            <w:tcW w:w="2833" w:type="dxa"/>
-            <w:vAlign w:val="center"/>
-          </w:tcPr>
-          <w:p>
-            <w:pPr>
-              <w:pStyle w:val="TableParagraph"/>
-              <w:jc w:val="center"/>
-            </w:pPr>
-            <w:r>
-              <w:t xml:space="preserve">Berhasil menampilkan data pengajuan cuti sesuai status yang dipilih.</w:t>
-            </w:r>
-          </w:p>
-        </w:tc>
-        <w:tc>
-          <w:tcPr>
-            <w:tcW w:w="2833" w:type="dxa"/>
-            <w:vAlign w:val="center"/>
-          </w:tcPr>
-          <w:p>
-            <w:pPr>
-              <w:pStyle w:val="TableParagraph"/>
-              <w:jc w:val="center"/>
-            </w:pPr>
-            <w:r>
-              <w:t xml:space="preserve">Berhasil menampilkan data pengajuan cuti sesuai status yang dipilih.</w:t>
+              <w:t xml:space="preserve">Klik button Ajukan Cuti - Mengisi semua field mandatory - Klik button Ajukan Cuti</w:t>
+            </w:r>
+          </w:p>
+        </w:tc>
+        <w:tc>
+          <w:tcPr>
+            <w:tcW w:w="2833" w:type="dxa"/>
+            <w:vAlign w:val="center"/>
+          </w:tcPr>
+          <w:p>
+            <w:pPr>
+              <w:pStyle w:val="TableParagraph"/>
+              <w:jc w:val="center"/>
+            </w:pPr>
+            <w:r>
+              <w:t xml:space="preserve">Berhasil mengajukan cuti.</w:t>
+            </w:r>
+          </w:p>
+        </w:tc>
+        <w:tc>
+          <w:tcPr>
+            <w:tcW w:w="2833" w:type="dxa"/>
+            <w:vAlign w:val="center"/>
+          </w:tcPr>
+          <w:p>
+            <w:pPr>
+              <w:pStyle w:val="TableParagraph"/>
+              <w:jc w:val="center"/>
+            </w:pPr>
+            <w:r>
+              <w:t xml:space="preserve">Berhasil mengajukan cuti.</w:t>
             </w:r>
           </w:p>
         </w:tc>
@@ -17003,139 +16961,8 @@
             <w:vAlign w:val="center"/>
           </w:tcPr>
           <w:p>
-            <w:pPr>
-              <w:pStyle w:val="TableParagraph"/>
-              <w:spacing w:before="134"/>
-              <w:ind w:left="176" w:right="168"/>
-              <w:jc w:val="center"/>
-            </w:pPr>
-            <w:r>
-              <w:t xml:space="preserve">9.8</w:t>
-            </w:r>
-          </w:p>
-        </w:tc>
-        <w:tc>
-          <w:tcPr>
-            <w:tcW w:w="2127" w:type="dxa"/>
-            <w:tcBorders>
-              <w:bottom w:val="single" w:sz="4" w:space="0" w:color="auto"/>
-            </w:tcBorders>
-            <w:vAlign w:val="center"/>
-          </w:tcPr>
-          <w:p>
-            <w:pPr>
-              <w:pStyle w:val="TableParagraph"/>
-              <w:jc w:val="center"/>
-            </w:pPr>
-            <w:r>
-              <w:t xml:space="preserve">Mengajukan cuti</w:t>
-            </w:r>
-          </w:p>
-        </w:tc>
-        <w:tc>
-          <w:tcPr>
-            <w:tcW w:w="2551" w:type="dxa"/>
-            <w:tcBorders>
-              <w:bottom w:val="single" w:sz="4" w:space="0" w:color="auto"/>
-            </w:tcBorders>
-            <w:vAlign w:val="center"/>
-          </w:tcPr>
-          <w:p>
-            <w:pPr>
-              <w:pStyle w:val="TableParagraph"/>
-              <w:jc w:val="center"/>
-              <w:rPr>
-                <w:w w:val="90"/>
-              </w:rPr>
-            </w:pPr>
-            <w:r>
-              <w:t xml:space="preserve">Klik button Ajukan Cuti - Mengisi semua field mandatory - Klik button Ajukan Cuti</w:t>
-            </w:r>
-          </w:p>
-        </w:tc>
-        <w:tc>
-          <w:tcPr>
-            <w:tcW w:w="2833" w:type="dxa"/>
-            <w:vAlign w:val="center"/>
-          </w:tcPr>
-          <w:p>
-            <w:pPr>
-              <w:pStyle w:val="TableParagraph"/>
-              <w:jc w:val="center"/>
-            </w:pPr>
-            <w:r>
-              <w:t xml:space="preserve">Berhasil mengajukan cuti.</w:t>
-            </w:r>
-          </w:p>
-        </w:tc>
-        <w:tc>
-          <w:tcPr>
-            <w:tcW w:w="2833" w:type="dxa"/>
-            <w:vAlign w:val="center"/>
-          </w:tcPr>
-          <w:p>
-            <w:pPr>
-              <w:pStyle w:val="TableParagraph"/>
-              <w:jc w:val="center"/>
-            </w:pPr>
-            <w:r>
-              <w:t xml:space="preserve">Berhasil mengajukan cuti.</w:t>
-            </w:r>
-          </w:p>
-        </w:tc>
-        <w:tc>
-          <w:tcPr>
-            <w:tcW w:w="1277" w:type="dxa"/>
-            <w:vAlign w:val="center"/>
-          </w:tcPr>
-          <w:p>
-            <w:pPr>
-              <w:pStyle w:val="TableParagraph"/>
-              <w:jc w:val="center"/>
-            </w:pPr>
-            <w:r>
-              <w:t xml:space="preserve">P</w:t>
-            </w:r>
-          </w:p>
-        </w:tc>
-        <w:tc>
-          <w:tcPr>
-            <w:tcW w:w="1699" w:type="dxa"/>
-            <w:vAlign w:val="center"/>
-          </w:tcPr>
-          <w:p>
-            <w:pPr>
-              <w:pStyle w:val="TableParagraph"/>
-              <w:jc w:val="center"/>
-            </w:pPr>
-            <w:r>
-              <w:t xml:space="preserve"/>
-            </w:r>
-          </w:p>
-        </w:tc>
-      </w:tr>
-      <w:tr>
-        <w:trPr>
-          <w:trHeight w:val="537"/>
-        </w:trPr>
-        <w:tc>
-          <w:tcPr>
-            <w:tcW w:w="867" w:type="dxa"/>
-            <w:tcBorders>
-              <w:left w:val="single" w:sz="6" w:space="0" w:color="000000"/>
-              <w:bottom w:val="single" w:sz="4" w:space="0" w:color="auto"/>
-            </w:tcBorders>
-            <w:vAlign w:val="center"/>
-          </w:tcPr>
-          <w:p>
-            <w:pPr>
-              <w:pStyle w:val="TableParagraph"/>
-              <w:spacing w:before="134"/>
-              <w:ind w:left="176" w:right="168"/>
-              <w:jc w:val="center"/>
-            </w:pPr>
-            <w:r>
-              <w:t xml:space="preserve">9.9</w:t>
+            <w:r>
+              <w:t>9.8</w:t>
             </w:r>
           </w:p>
         </w:tc>
@@ -26008,14 +25835,8 @@
             <w:vAlign w:val="center"/>
           </w:tcPr>
           <w:p>
-            <w:pPr>
-              <w:pStyle w:val="TableParagraph"/>
-              <w:spacing w:before="134"/>
-              <w:ind w:left="176" w:right="168"/>
-              <w:jc w:val="center"/>
-            </w:pPr>
-            <w:r>
-              <w:t xml:space="preserve">14.1</w:t>
+            <w:r>
+              <w:t>14.1</w:t>
             </w:r>
           </w:p>
         </w:tc>
@@ -26133,14 +25954,8 @@
             <w:vAlign w:val="center"/>
           </w:tcPr>
           <w:p>
-            <w:pPr>
-              <w:pStyle w:val="TableParagraph"/>
-              <w:spacing w:before="134"/>
-              <w:ind w:left="176" w:right="168"/>
-              <w:jc w:val="center"/>
-            </w:pPr>
-            <w:r>
-              <w:t xml:space="preserve">14.2</w:t>
+            <w:r>
+              <w:t>14.2</w:t>
             </w:r>
           </w:p>
         </w:tc>
@@ -26158,7 +25973,7 @@
               <w:jc w:val="center"/>
             </w:pPr>
             <w:r>
-              <w:t xml:space="preserve">Melihat daftar pengingat pada tab Aktif</w:t>
+              <w:t xml:space="preserve">Melihat daftar pengingat pada tab Selesai</w:t>
             </w:r>
           </w:p>
         </w:tc>
@@ -26179,37 +25994,37 @@
               </w:rPr>
             </w:pPr>
             <w:r>
-              <w:t xml:space="preserve">Klik tab Aktif</w:t>
-            </w:r>
-          </w:p>
-        </w:tc>
-        <w:tc>
-          <w:tcPr>
-            <w:tcW w:w="2833" w:type="dxa"/>
-            <w:vAlign w:val="center"/>
-          </w:tcPr>
-          <w:p>
-            <w:pPr>
-              <w:pStyle w:val="TableParagraph"/>
-              <w:jc w:val="center"/>
-            </w:pPr>
-            <w:r>
-              <w:t xml:space="preserve">Berhasil menampilkan daftar pengingat yang sedang aktif.</w:t>
-            </w:r>
-          </w:p>
-        </w:tc>
-        <w:tc>
-          <w:tcPr>
-            <w:tcW w:w="2833" w:type="dxa"/>
-            <w:vAlign w:val="center"/>
-          </w:tcPr>
-          <w:p>
-            <w:pPr>
-              <w:pStyle w:val="TableParagraph"/>
-              <w:jc w:val="center"/>
-            </w:pPr>
-            <w:r>
-              <w:t xml:space="preserve">Berhasil menampilkan daftar pengingat yang sedang aktif.</w:t>
+              <w:t xml:space="preserve">Klik tab Selesai</w:t>
+            </w:r>
+          </w:p>
+        </w:tc>
+        <w:tc>
+          <w:tcPr>
+            <w:tcW w:w="2833" w:type="dxa"/>
+            <w:vAlign w:val="center"/>
+          </w:tcPr>
+          <w:p>
+            <w:pPr>
+              <w:pStyle w:val="TableParagraph"/>
+              <w:jc w:val="center"/>
+            </w:pPr>
+            <w:r>
+              <w:t xml:space="preserve">Berhasil menampilkan daftar pengingat yang sudah selesai.</w:t>
+            </w:r>
+          </w:p>
+        </w:tc>
+        <w:tc>
+          <w:tcPr>
+            <w:tcW w:w="2833" w:type="dxa"/>
+            <w:vAlign w:val="center"/>
+          </w:tcPr>
+          <w:p>
+            <w:pPr>
+              <w:pStyle w:val="TableParagraph"/>
+              <w:jc w:val="center"/>
+            </w:pPr>
+            <w:r>
+              <w:t xml:space="preserve">Berhasil menampilkan daftar pengingat yang sudah selesai.</w:t>
             </w:r>
           </w:p>
         </w:tc>
@@ -26258,14 +26073,8 @@
             <w:vAlign w:val="center"/>
           </w:tcPr>
           <w:p>
-            <w:pPr>
-              <w:pStyle w:val="TableParagraph"/>
-              <w:spacing w:before="134"/>
-              <w:ind w:left="176" w:right="168"/>
-              <w:jc w:val="center"/>
-            </w:pPr>
-            <w:r>
-              <w:t xml:space="preserve">14.3</w:t>
+            <w:r>
+              <w:t>14.3</w:t>
             </w:r>
           </w:p>
         </w:tc>
@@ -26283,7 +26092,7 @@
               <w:jc w:val="center"/>
             </w:pPr>
             <w:r>
-              <w:t xml:space="preserve">Melihat daftar pengingat pada tab Selesai</w:t>
+              <w:t xml:space="preserve">Menambahkan pengingat baru dengan data valid</w:t>
             </w:r>
           </w:p>
         </w:tc>
@@ -26304,37 +26113,37 @@
               </w:rPr>
             </w:pPr>
             <w:r>
-              <w:t xml:space="preserve">Klik tab Selesai</w:t>
-            </w:r>
-          </w:p>
-        </w:tc>
-        <w:tc>
-          <w:tcPr>
-            <w:tcW w:w="2833" w:type="dxa"/>
-            <w:vAlign w:val="center"/>
-          </w:tcPr>
-          <w:p>
-            <w:pPr>
-              <w:pStyle w:val="TableParagraph"/>
-              <w:jc w:val="center"/>
-            </w:pPr>
-            <w:r>
-              <w:t xml:space="preserve">Berhasil menampilkan daftar pengingat yang sudah selesai.</w:t>
-            </w:r>
-          </w:p>
-        </w:tc>
-        <w:tc>
-          <w:tcPr>
-            <w:tcW w:w="2833" w:type="dxa"/>
-            <w:vAlign w:val="center"/>
-          </w:tcPr>
-          <w:p>
-            <w:pPr>
-              <w:pStyle w:val="TableParagraph"/>
-              <w:jc w:val="center"/>
-            </w:pPr>
-            <w:r>
-              <w:t xml:space="preserve">Berhasil menampilkan daftar pengingat yang sudah selesai.</w:t>
+              <w:t xml:space="preserve">Klik button + Baru - Mengisi seluruh field mandatory pada form Tambah Pengingat dengan data valid - Klik button Simpan</w:t>
+            </w:r>
+          </w:p>
+        </w:tc>
+        <w:tc>
+          <w:tcPr>
+            <w:tcW w:w="2833" w:type="dxa"/>
+            <w:vAlign w:val="center"/>
+          </w:tcPr>
+          <w:p>
+            <w:pPr>
+              <w:pStyle w:val="TableParagraph"/>
+              <w:jc w:val="center"/>
+            </w:pPr>
+            <w:r>
+              <w:t xml:space="preserve">Berhasil menyimpan pengingat dan menampilkan pengingat baru pada daftar.</w:t>
+            </w:r>
+          </w:p>
+        </w:tc>
+        <w:tc>
+          <w:tcPr>
+            <w:tcW w:w="2833" w:type="dxa"/>
+            <w:vAlign w:val="center"/>
+          </w:tcPr>
+          <w:p>
+            <w:pPr>
+              <w:pStyle w:val="TableParagraph"/>
+              <w:jc w:val="center"/>
+            </w:pPr>
+            <w:r>
+              <w:t xml:space="preserve">Berhasil menyimpan pengingat dan menampilkan pengingat baru pada daftar.</w:t>
             </w:r>
           </w:p>
         </w:tc>
@@ -26383,14 +26192,8 @@
             <w:vAlign w:val="center"/>
           </w:tcPr>
           <w:p>
-            <w:pPr>
-              <w:pStyle w:val="TableParagraph"/>
-              <w:spacing w:before="134"/>
-              <w:ind w:left="176" w:right="168"/>
-              <w:jc w:val="center"/>
-            </w:pPr>
-            <w:r>
-              <w:t xml:space="preserve">14.4</w:t>
+            <w:r>
+              <w:t>14.4</w:t>
             </w:r>
           </w:p>
         </w:tc>
@@ -26408,7 +26211,7 @@
               <w:jc w:val="center"/>
             </w:pPr>
             <w:r>
-              <w:t xml:space="preserve">Menambahkan pengingat baru dengan data valid</w:t>
+              <w:t xml:space="preserve">Menambahkan pengingat baru tanpa mengisi field mandatory</w:t>
             </w:r>
           </w:p>
         </w:tc>
@@ -26429,37 +26232,37 @@
               </w:rPr>
             </w:pPr>
             <w:r>
-              <w:t xml:space="preserve">Klik button + Baru - Mengisi seluruh field mandatory pada form Tambah Pengingat dengan data valid - Klik button Simpan</w:t>
-            </w:r>
-          </w:p>
-        </w:tc>
-        <w:tc>
-          <w:tcPr>
-            <w:tcW w:w="2833" w:type="dxa"/>
-            <w:vAlign w:val="center"/>
-          </w:tcPr>
-          <w:p>
-            <w:pPr>
-              <w:pStyle w:val="TableParagraph"/>
-              <w:jc w:val="center"/>
-            </w:pPr>
-            <w:r>
-              <w:t xml:space="preserve">Berhasil menyimpan pengingat dan menampilkan pengingat baru pada daftar.</w:t>
-            </w:r>
-          </w:p>
-        </w:tc>
-        <w:tc>
-          <w:tcPr>
-            <w:tcW w:w="2833" w:type="dxa"/>
-            <w:vAlign w:val="center"/>
-          </w:tcPr>
-          <w:p>
-            <w:pPr>
-              <w:pStyle w:val="TableParagraph"/>
-              <w:jc w:val="center"/>
-            </w:pPr>
-            <w:r>
-              <w:t xml:space="preserve">Berhasil menyimpan pengingat dan menampilkan pengingat baru pada daftar.</w:t>
+              <w:t xml:space="preserve">Klik button + Baru - Mengosongkan seluruh field mandatory pada form Tambah Pengingat - Klik button Simpan</w:t>
+            </w:r>
+          </w:p>
+        </w:tc>
+        <w:tc>
+          <w:tcPr>
+            <w:tcW w:w="2833" w:type="dxa"/>
+            <w:vAlign w:val="center"/>
+          </w:tcPr>
+          <w:p>
+            <w:pPr>
+              <w:pStyle w:val="TableParagraph"/>
+              <w:jc w:val="center"/>
+            </w:pPr>
+            <w:r>
+              <w:t xml:space="preserve">Berhasil menampilkan pesan validasi bahwa field mandatory harus diisi.</w:t>
+            </w:r>
+          </w:p>
+        </w:tc>
+        <w:tc>
+          <w:tcPr>
+            <w:tcW w:w="2833" w:type="dxa"/>
+            <w:vAlign w:val="center"/>
+          </w:tcPr>
+          <w:p>
+            <w:pPr>
+              <w:pStyle w:val="TableParagraph"/>
+              <w:jc w:val="center"/>
+            </w:pPr>
+            <w:r>
+              <w:t xml:space="preserve">Berhasil menampilkan pesan validasi bahwa field mandatory harus diisi.</w:t>
             </w:r>
           </w:p>
         </w:tc>
@@ -26508,139 +26311,8 @@
             <w:vAlign w:val="center"/>
           </w:tcPr>
           <w:p>
-            <w:pPr>
-              <w:pStyle w:val="TableParagraph"/>
-              <w:spacing w:before="134"/>
-              <w:ind w:left="176" w:right="168"/>
-              <w:jc w:val="center"/>
-            </w:pPr>
-            <w:r>
-              <w:t xml:space="preserve">14.5</w:t>
-            </w:r>
-          </w:p>
-        </w:tc>
-        <w:tc>
-          <w:tcPr>
-            <w:tcW w:w="2127" w:type="dxa"/>
-            <w:tcBorders>
-              <w:bottom w:val="single" w:sz="4" w:space="0" w:color="auto"/>
-            </w:tcBorders>
-            <w:vAlign w:val="center"/>
-          </w:tcPr>
-          <w:p>
-            <w:pPr>
-              <w:pStyle w:val="TableParagraph"/>
-              <w:jc w:val="center"/>
-            </w:pPr>
-            <w:r>
-              <w:t xml:space="preserve">Menambahkan pengingat baru tanpa mengisi field mandatory</w:t>
-            </w:r>
-          </w:p>
-        </w:tc>
-        <w:tc>
-          <w:tcPr>
-            <w:tcW w:w="2551" w:type="dxa"/>
-            <w:tcBorders>
-              <w:bottom w:val="single" w:sz="4" w:space="0" w:color="auto"/>
-            </w:tcBorders>
-            <w:vAlign w:val="center"/>
-          </w:tcPr>
-          <w:p>
-            <w:pPr>
-              <w:pStyle w:val="TableParagraph"/>
-              <w:jc w:val="center"/>
-              <w:rPr>
-                <w:w w:val="90"/>
-              </w:rPr>
-            </w:pPr>
-            <w:r>
-              <w:t xml:space="preserve">Klik button + Baru - Mengosongkan seluruh field mandatory pada form Tambah Pengingat - Klik button Simpan</w:t>
-            </w:r>
-          </w:p>
-        </w:tc>
-        <w:tc>
-          <w:tcPr>
-            <w:tcW w:w="2833" w:type="dxa"/>
-            <w:vAlign w:val="center"/>
-          </w:tcPr>
-          <w:p>
-            <w:pPr>
-              <w:pStyle w:val="TableParagraph"/>
-              <w:jc w:val="center"/>
-            </w:pPr>
-            <w:r>
-              <w:t xml:space="preserve">Berhasil menampilkan pesan validasi bahwa field mandatory harus diisi.</w:t>
-            </w:r>
-          </w:p>
-        </w:tc>
-        <w:tc>
-          <w:tcPr>
-            <w:tcW w:w="2833" w:type="dxa"/>
-            <w:vAlign w:val="center"/>
-          </w:tcPr>
-          <w:p>
-            <w:pPr>
-              <w:pStyle w:val="TableParagraph"/>
-              <w:jc w:val="center"/>
-            </w:pPr>
-            <w:r>
-              <w:t xml:space="preserve">Berhasil menampilkan pesan validasi bahwa field mandatory harus diisi.</w:t>
-            </w:r>
-          </w:p>
-        </w:tc>
-        <w:tc>
-          <w:tcPr>
-            <w:tcW w:w="1277" w:type="dxa"/>
-            <w:vAlign w:val="center"/>
-          </w:tcPr>
-          <w:p>
-            <w:pPr>
-              <w:pStyle w:val="TableParagraph"/>
-              <w:jc w:val="center"/>
-            </w:pPr>
-            <w:r>
-              <w:t xml:space="preserve">P</w:t>
-            </w:r>
-          </w:p>
-        </w:tc>
-        <w:tc>
-          <w:tcPr>
-            <w:tcW w:w="1699" w:type="dxa"/>
-            <w:vAlign w:val="center"/>
-          </w:tcPr>
-          <w:p>
-            <w:pPr>
-              <w:pStyle w:val="TableParagraph"/>
-              <w:jc w:val="center"/>
-            </w:pPr>
-            <w:r>
-              <w:t xml:space="preserve"/>
-            </w:r>
-          </w:p>
-        </w:tc>
-      </w:tr>
-      <w:tr>
-        <w:trPr>
-          <w:trHeight w:val="537"/>
-        </w:trPr>
-        <w:tc>
-          <w:tcPr>
-            <w:tcW w:w="867" w:type="dxa"/>
-            <w:tcBorders>
-              <w:left w:val="single" w:sz="6" w:space="0" w:color="000000"/>
-              <w:bottom w:val="single" w:sz="4" w:space="0" w:color="auto"/>
-            </w:tcBorders>
-            <w:vAlign w:val="center"/>
-          </w:tcPr>
-          <w:p>
-            <w:pPr>
-              <w:pStyle w:val="TableParagraph"/>
-              <w:spacing w:before="134"/>
-              <w:ind w:left="176" w:right="168"/>
-              <w:jc w:val="center"/>
-            </w:pPr>
-            <w:r>
-              <w:t xml:space="preserve">14.6</w:t>
+            <w:r>
+              <w:t>14.5</w:t>
             </w:r>
           </w:p>
         </w:tc>
@@ -27134,14 +26806,8 @@
             <w:vAlign w:val="center"/>
           </w:tcPr>
           <w:p>
-            <w:pPr>
-              <w:pStyle w:val="TableParagraph"/>
-              <w:spacing w:before="134"/>
-              <w:ind w:left="176" w:right="168"/>
-              <w:jc w:val="center"/>
-            </w:pPr>
-            <w:r>
-              <w:t xml:space="preserve">15.1</w:t>
+            <w:r>
+              <w:t>15.1</w:t>
             </w:r>
           </w:p>
         </w:tc>
@@ -27259,14 +26925,8 @@
             <w:vAlign w:val="center"/>
           </w:tcPr>
           <w:p>
-            <w:pPr>
-              <w:pStyle w:val="TableParagraph"/>
-              <w:spacing w:before="134"/>
-              <w:ind w:left="176" w:right="168"/>
-              <w:jc w:val="center"/>
-            </w:pPr>
-            <w:r>
-              <w:t xml:space="preserve">15.2</w:t>
+            <w:r>
+              <w:t>15.2</w:t>
             </w:r>
           </w:p>
         </w:tc>
@@ -27284,7 +26944,7 @@
               <w:jc w:val="center"/>
             </w:pPr>
             <w:r>
-              <w:t xml:space="preserve">Melihat daftar agenda pada tab Masuk</w:t>
+              <w:t xml:space="preserve">Melihat daftar agenda pada tab Closing</w:t>
             </w:r>
           </w:p>
         </w:tc>
@@ -27305,37 +26965,37 @@
               </w:rPr>
             </w:pPr>
             <w:r>
-              <w:t xml:space="preserve">Klik tab Masuk</w:t>
-            </w:r>
-          </w:p>
-        </w:tc>
-        <w:tc>
-          <w:tcPr>
-            <w:tcW w:w="2833" w:type="dxa"/>
-            <w:vAlign w:val="center"/>
-          </w:tcPr>
-          <w:p>
-            <w:pPr>
-              <w:pStyle w:val="TableParagraph"/>
-              <w:jc w:val="center"/>
-            </w:pPr>
-            <w:r>
-              <w:t xml:space="preserve">Berhasil menampilkan daftar nasabah yang masuk pada Daily Sales Agenda.</w:t>
-            </w:r>
-          </w:p>
-        </w:tc>
-        <w:tc>
-          <w:tcPr>
-            <w:tcW w:w="2833" w:type="dxa"/>
-            <w:vAlign w:val="center"/>
-          </w:tcPr>
-          <w:p>
-            <w:pPr>
-              <w:pStyle w:val="TableParagraph"/>
-              <w:jc w:val="center"/>
-            </w:pPr>
-            <w:r>
-              <w:t xml:space="preserve">Berhasil menampilkan daftar nasabah yang masuk pada Daily Sales Agenda.</w:t>
+              <w:t xml:space="preserve">Klik tab Closing</w:t>
+            </w:r>
+          </w:p>
+        </w:tc>
+        <w:tc>
+          <w:tcPr>
+            <w:tcW w:w="2833" w:type="dxa"/>
+            <w:vAlign w:val="center"/>
+          </w:tcPr>
+          <w:p>
+            <w:pPr>
+              <w:pStyle w:val="TableParagraph"/>
+              <w:jc w:val="center"/>
+            </w:pPr>
+            <w:r>
+              <w:t xml:space="preserve">Berhasil menampilkan daftar nasabah yang closing pada Daily Sales Agenda.</w:t>
+            </w:r>
+          </w:p>
+        </w:tc>
+        <w:tc>
+          <w:tcPr>
+            <w:tcW w:w="2833" w:type="dxa"/>
+            <w:vAlign w:val="center"/>
+          </w:tcPr>
+          <w:p>
+            <w:pPr>
+              <w:pStyle w:val="TableParagraph"/>
+              <w:jc w:val="center"/>
+            </w:pPr>
+            <w:r>
+              <w:t xml:space="preserve">Berhasil menampilkan daftar nasabah yang closing pada Daily Sales Agenda.</w:t>
             </w:r>
           </w:p>
         </w:tc>
@@ -27384,14 +27044,8 @@
             <w:vAlign w:val="center"/>
           </w:tcPr>
           <w:p>
-            <w:pPr>
-              <w:pStyle w:val="TableParagraph"/>
-              <w:spacing w:before="134"/>
-              <w:ind w:left="176" w:right="168"/>
-              <w:jc w:val="center"/>
-            </w:pPr>
-            <w:r>
-              <w:t xml:space="preserve">15.3</w:t>
+            <w:r>
+              <w:t>15.3</w:t>
             </w:r>
           </w:p>
         </w:tc>
@@ -27409,7 +27063,7 @@
               <w:jc w:val="center"/>
             </w:pPr>
             <w:r>
-              <w:t xml:space="preserve">Melihat daftar agenda pada tab Closing</w:t>
+              <w:t xml:space="preserve">Melihat daftar agenda pada tab Referral</w:t>
             </w:r>
           </w:p>
         </w:tc>
@@ -27430,37 +27084,37 @@
               </w:rPr>
             </w:pPr>
             <w:r>
-              <w:t xml:space="preserve">Klik tab Closing</w:t>
-            </w:r>
-          </w:p>
-        </w:tc>
-        <w:tc>
-          <w:tcPr>
-            <w:tcW w:w="2833" w:type="dxa"/>
-            <w:vAlign w:val="center"/>
-          </w:tcPr>
-          <w:p>
-            <w:pPr>
-              <w:pStyle w:val="TableParagraph"/>
-              <w:jc w:val="center"/>
-            </w:pPr>
-            <w:r>
-              <w:t xml:space="preserve">Berhasil menampilkan daftar nasabah yang closing pada Daily Sales Agenda.</w:t>
-            </w:r>
-          </w:p>
-        </w:tc>
-        <w:tc>
-          <w:tcPr>
-            <w:tcW w:w="2833" w:type="dxa"/>
-            <w:vAlign w:val="center"/>
-          </w:tcPr>
-          <w:p>
-            <w:pPr>
-              <w:pStyle w:val="TableParagraph"/>
-              <w:jc w:val="center"/>
-            </w:pPr>
-            <w:r>
-              <w:t xml:space="preserve">Berhasil menampilkan daftar nasabah yang closing pada Daily Sales Agenda.</w:t>
+              <w:t xml:space="preserve">Klik tab Referral</w:t>
+            </w:r>
+          </w:p>
+        </w:tc>
+        <w:tc>
+          <w:tcPr>
+            <w:tcW w:w="2833" w:type="dxa"/>
+            <w:vAlign w:val="center"/>
+          </w:tcPr>
+          <w:p>
+            <w:pPr>
+              <w:pStyle w:val="TableParagraph"/>
+              <w:jc w:val="center"/>
+            </w:pPr>
+            <w:r>
+              <w:t xml:space="preserve">Berhasil menampilkan daftar nasabah referral pada Daily Sales Agenda.</w:t>
+            </w:r>
+          </w:p>
+        </w:tc>
+        <w:tc>
+          <w:tcPr>
+            <w:tcW w:w="2833" w:type="dxa"/>
+            <w:vAlign w:val="center"/>
+          </w:tcPr>
+          <w:p>
+            <w:pPr>
+              <w:pStyle w:val="TableParagraph"/>
+              <w:jc w:val="center"/>
+            </w:pPr>
+            <w:r>
+              <w:t xml:space="preserve">Berhasil menampilkan daftar nasabah referral pada Daily Sales Agenda.</w:t>
             </w:r>
           </w:p>
         </w:tc>
@@ -27509,14 +27163,8 @@
             <w:vAlign w:val="center"/>
           </w:tcPr>
           <w:p>
-            <w:pPr>
-              <w:pStyle w:val="TableParagraph"/>
-              <w:spacing w:before="134"/>
-              <w:ind w:left="176" w:right="168"/>
-              <w:jc w:val="center"/>
-            </w:pPr>
-            <w:r>
-              <w:t xml:space="preserve">15.4</w:t>
+            <w:r>
+              <w:t>15.4</w:t>
             </w:r>
           </w:p>
         </w:tc>
@@ -27534,7 +27182,7 @@
               <w:jc w:val="center"/>
             </w:pPr>
             <w:r>
-              <w:t xml:space="preserve">Melihat daftar agenda pada tab Referral</w:t>
+              <w:t xml:space="preserve">Melihat daftar agenda pada tab Ref. Closing</w:t>
             </w:r>
           </w:p>
         </w:tc>
@@ -27555,37 +27203,37 @@
               </w:rPr>
             </w:pPr>
             <w:r>
-              <w:t xml:space="preserve">Klik tab Referral</w:t>
-            </w:r>
-          </w:p>
-        </w:tc>
-        <w:tc>
-          <w:tcPr>
-            <w:tcW w:w="2833" w:type="dxa"/>
-            <w:vAlign w:val="center"/>
-          </w:tcPr>
-          <w:p>
-            <w:pPr>
-              <w:pStyle w:val="TableParagraph"/>
-              <w:jc w:val="center"/>
-            </w:pPr>
-            <w:r>
-              <w:t xml:space="preserve">Berhasil menampilkan daftar nasabah referral pada Daily Sales Agenda.</w:t>
-            </w:r>
-          </w:p>
-        </w:tc>
-        <w:tc>
-          <w:tcPr>
-            <w:tcW w:w="2833" w:type="dxa"/>
-            <w:vAlign w:val="center"/>
-          </w:tcPr>
-          <w:p>
-            <w:pPr>
-              <w:pStyle w:val="TableParagraph"/>
-              <w:jc w:val="center"/>
-            </w:pPr>
-            <w:r>
-              <w:t xml:space="preserve">Berhasil menampilkan daftar nasabah referral pada Daily Sales Agenda.</w:t>
+              <w:t xml:space="preserve">Klik tab Ref. Closing</w:t>
+            </w:r>
+          </w:p>
+        </w:tc>
+        <w:tc>
+          <w:tcPr>
+            <w:tcW w:w="2833" w:type="dxa"/>
+            <w:vAlign w:val="center"/>
+          </w:tcPr>
+          <w:p>
+            <w:pPr>
+              <w:pStyle w:val="TableParagraph"/>
+              <w:jc w:val="center"/>
+            </w:pPr>
+            <w:r>
+              <w:t xml:space="preserve">Berhasil menampilkan daftar nasabah referral yang closing pada Daily Sales Agenda.</w:t>
+            </w:r>
+          </w:p>
+        </w:tc>
+        <w:tc>
+          <w:tcPr>
+            <w:tcW w:w="2833" w:type="dxa"/>
+            <w:vAlign w:val="center"/>
+          </w:tcPr>
+          <w:p>
+            <w:pPr>
+              <w:pStyle w:val="TableParagraph"/>
+              <w:jc w:val="center"/>
+            </w:pPr>
+            <w:r>
+              <w:t xml:space="preserve">Berhasil menampilkan daftar nasabah referral yang closing pada Daily Sales Agenda.</w:t>
             </w:r>
           </w:p>
         </w:tc>
@@ -27634,14 +27282,8 @@
             <w:vAlign w:val="center"/>
           </w:tcPr>
           <w:p>
-            <w:pPr>
-              <w:pStyle w:val="TableParagraph"/>
-              <w:spacing w:before="134"/>
-              <w:ind w:left="176" w:right="168"/>
-              <w:jc w:val="center"/>
-            </w:pPr>
-            <w:r>
-              <w:t xml:space="preserve">15.5</w:t>
+            <w:r>
+              <w:t>15.5</w:t>
             </w:r>
           </w:p>
         </w:tc>
@@ -27659,7 +27301,7 @@
               <w:jc w:val="center"/>
             </w:pPr>
             <w:r>
-              <w:t xml:space="preserve">Melihat daftar agenda pada tab Ref. Closing</w:t>
+              <w:t xml:space="preserve">Mencari agenda menggunakan Search Bar</w:t>
             </w:r>
           </w:p>
         </w:tc>
@@ -27680,37 +27322,37 @@
               </w:rPr>
             </w:pPr>
             <w:r>
-              <w:t xml:space="preserve">Klik tab Ref. Closing</w:t>
-            </w:r>
-          </w:p>
-        </w:tc>
-        <w:tc>
-          <w:tcPr>
-            <w:tcW w:w="2833" w:type="dxa"/>
-            <w:vAlign w:val="center"/>
-          </w:tcPr>
-          <w:p>
-            <w:pPr>
-              <w:pStyle w:val="TableParagraph"/>
-              <w:jc w:val="center"/>
-            </w:pPr>
-            <w:r>
-              <w:t xml:space="preserve">Berhasil menampilkan daftar nasabah referral yang closing pada Daily Sales Agenda.</w:t>
-            </w:r>
-          </w:p>
-        </w:tc>
-        <w:tc>
-          <w:tcPr>
-            <w:tcW w:w="2833" w:type="dxa"/>
-            <w:vAlign w:val="center"/>
-          </w:tcPr>
-          <w:p>
-            <w:pPr>
-              <w:pStyle w:val="TableParagraph"/>
-              <w:jc w:val="center"/>
-            </w:pPr>
-            <w:r>
-              <w:t xml:space="preserve">Berhasil menampilkan daftar nasabah referral yang closing pada Daily Sales Agenda.</w:t>
+              <w:t xml:space="preserve">Masukkan kata kunci pencarian pada Search Bar</w:t>
+            </w:r>
+          </w:p>
+        </w:tc>
+        <w:tc>
+          <w:tcPr>
+            <w:tcW w:w="2833" w:type="dxa"/>
+            <w:vAlign w:val="center"/>
+          </w:tcPr>
+          <w:p>
+            <w:pPr>
+              <w:pStyle w:val="TableParagraph"/>
+              <w:jc w:val="center"/>
+            </w:pPr>
+            <w:r>
+              <w:t xml:space="preserve">Berhasil menampilkan data agenda yang sesuai dengan kata kunci pencarian.</w:t>
+            </w:r>
+          </w:p>
+        </w:tc>
+        <w:tc>
+          <w:tcPr>
+            <w:tcW w:w="2833" w:type="dxa"/>
+            <w:vAlign w:val="center"/>
+          </w:tcPr>
+          <w:p>
+            <w:pPr>
+              <w:pStyle w:val="TableParagraph"/>
+              <w:jc w:val="center"/>
+            </w:pPr>
+            <w:r>
+              <w:t xml:space="preserve">Berhasil menampilkan data agenda yang sesuai dengan kata kunci pencarian.</w:t>
             </w:r>
           </w:p>
         </w:tc>
@@ -27759,14 +27401,8 @@
             <w:vAlign w:val="center"/>
           </w:tcPr>
           <w:p>
-            <w:pPr>
-              <w:pStyle w:val="TableParagraph"/>
-              <w:spacing w:before="134"/>
-              <w:ind w:left="176" w:right="168"/>
-              <w:jc w:val="center"/>
-            </w:pPr>
-            <w:r>
-              <w:t xml:space="preserve">15.6</w:t>
+            <w:r>
+              <w:t>15.6</w:t>
             </w:r>
           </w:p>
         </w:tc>
@@ -27784,7 +27420,7 @@
               <w:jc w:val="center"/>
             </w:pPr>
             <w:r>
-              <w:t xml:space="preserve">Mencari agenda menggunakan Search Bar</w:t>
+              <w:t xml:space="preserve">Mencari agenda dengan keyword tidak valid</w:t>
             </w:r>
           </w:p>
         </w:tc>
@@ -27805,37 +27441,37 @@
               </w:rPr>
             </w:pPr>
             <w:r>
-              <w:t xml:space="preserve">Masukkan kata kunci pencarian pada Search Bar</w:t>
-            </w:r>
-          </w:p>
-        </w:tc>
-        <w:tc>
-          <w:tcPr>
-            <w:tcW w:w="2833" w:type="dxa"/>
-            <w:vAlign w:val="center"/>
-          </w:tcPr>
-          <w:p>
-            <w:pPr>
-              <w:pStyle w:val="TableParagraph"/>
-              <w:jc w:val="center"/>
-            </w:pPr>
-            <w:r>
-              <w:t xml:space="preserve">Berhasil menampilkan data agenda yang sesuai dengan kata kunci pencarian.</w:t>
-            </w:r>
-          </w:p>
-        </w:tc>
-        <w:tc>
-          <w:tcPr>
-            <w:tcW w:w="2833" w:type="dxa"/>
-            <w:vAlign w:val="center"/>
-          </w:tcPr>
-          <w:p>
-            <w:pPr>
-              <w:pStyle w:val="TableParagraph"/>
-              <w:jc w:val="center"/>
-            </w:pPr>
-            <w:r>
-              <w:t xml:space="preserve">Berhasil menampilkan data agenda yang sesuai dengan kata kunci pencarian.</w:t>
+              <w:t xml:space="preserve">Masukkan keyword tidak valid pada Search Bar</w:t>
+            </w:r>
+          </w:p>
+        </w:tc>
+        <w:tc>
+          <w:tcPr>
+            <w:tcW w:w="2833" w:type="dxa"/>
+            <w:vAlign w:val="center"/>
+          </w:tcPr>
+          <w:p>
+            <w:pPr>
+              <w:pStyle w:val="TableParagraph"/>
+              <w:jc w:val="center"/>
+            </w:pPr>
+            <w:r>
+              <w:t xml:space="preserve">Berhasil menampilkan informasi data tidak ditemukan.</w:t>
+            </w:r>
+          </w:p>
+        </w:tc>
+        <w:tc>
+          <w:tcPr>
+            <w:tcW w:w="2833" w:type="dxa"/>
+            <w:vAlign w:val="center"/>
+          </w:tcPr>
+          <w:p>
+            <w:pPr>
+              <w:pStyle w:val="TableParagraph"/>
+              <w:jc w:val="center"/>
+            </w:pPr>
+            <w:r>
+              <w:t xml:space="preserve">Berhasil menampilkan informasi data tidak ditemukan.</w:t>
             </w:r>
           </w:p>
         </w:tc>
@@ -27884,139 +27520,8 @@
             <w:vAlign w:val="center"/>
           </w:tcPr>
           <w:p>
-            <w:pPr>
-              <w:pStyle w:val="TableParagraph"/>
-              <w:spacing w:before="134"/>
-              <w:ind w:left="176" w:right="168"/>
-              <w:jc w:val="center"/>
-            </w:pPr>
-            <w:r>
-              <w:t xml:space="preserve">15.7</w:t>
-            </w:r>
-          </w:p>
-        </w:tc>
-        <w:tc>
-          <w:tcPr>
-            <w:tcW w:w="2127" w:type="dxa"/>
-            <w:tcBorders>
-              <w:bottom w:val="single" w:sz="4" w:space="0" w:color="auto"/>
-            </w:tcBorders>
-            <w:vAlign w:val="center"/>
-          </w:tcPr>
-          <w:p>
-            <w:pPr>
-              <w:pStyle w:val="TableParagraph"/>
-              <w:jc w:val="center"/>
-            </w:pPr>
-            <w:r>
-              <w:t xml:space="preserve">Mencari agenda dengan keyword tidak valid</w:t>
-            </w:r>
-          </w:p>
-        </w:tc>
-        <w:tc>
-          <w:tcPr>
-            <w:tcW w:w="2551" w:type="dxa"/>
-            <w:tcBorders>
-              <w:bottom w:val="single" w:sz="4" w:space="0" w:color="auto"/>
-            </w:tcBorders>
-            <w:vAlign w:val="center"/>
-          </w:tcPr>
-          <w:p>
-            <w:pPr>
-              <w:pStyle w:val="TableParagraph"/>
-              <w:jc w:val="center"/>
-              <w:rPr>
-                <w:w w:val="90"/>
-              </w:rPr>
-            </w:pPr>
-            <w:r>
-              <w:t xml:space="preserve">Masukkan keyword tidak valid pada Search Bar</w:t>
-            </w:r>
-          </w:p>
-        </w:tc>
-        <w:tc>
-          <w:tcPr>
-            <w:tcW w:w="2833" w:type="dxa"/>
-            <w:vAlign w:val="center"/>
-          </w:tcPr>
-          <w:p>
-            <w:pPr>
-              <w:pStyle w:val="TableParagraph"/>
-              <w:jc w:val="center"/>
-            </w:pPr>
-            <w:r>
-              <w:t xml:space="preserve">Berhasil menampilkan informasi data tidak ditemukan.</w:t>
-            </w:r>
-          </w:p>
-        </w:tc>
-        <w:tc>
-          <w:tcPr>
-            <w:tcW w:w="2833" w:type="dxa"/>
-            <w:vAlign w:val="center"/>
-          </w:tcPr>
-          <w:p>
-            <w:pPr>
-              <w:pStyle w:val="TableParagraph"/>
-              <w:jc w:val="center"/>
-            </w:pPr>
-            <w:r>
-              <w:t xml:space="preserve">Berhasil menampilkan informasi data tidak ditemukan.</w:t>
-            </w:r>
-          </w:p>
-        </w:tc>
-        <w:tc>
-          <w:tcPr>
-            <w:tcW w:w="1277" w:type="dxa"/>
-            <w:vAlign w:val="center"/>
-          </w:tcPr>
-          <w:p>
-            <w:pPr>
-              <w:pStyle w:val="TableParagraph"/>
-              <w:jc w:val="center"/>
-            </w:pPr>
-            <w:r>
-              <w:t xml:space="preserve">P</w:t>
-            </w:r>
-          </w:p>
-        </w:tc>
-        <w:tc>
-          <w:tcPr>
-            <w:tcW w:w="1699" w:type="dxa"/>
-            <w:vAlign w:val="center"/>
-          </w:tcPr>
-          <w:p>
-            <w:pPr>
-              <w:pStyle w:val="TableParagraph"/>
-              <w:jc w:val="center"/>
-            </w:pPr>
-            <w:r>
-              <w:t xml:space="preserve"/>
-            </w:r>
-          </w:p>
-        </w:tc>
-      </w:tr>
-      <w:tr>
-        <w:trPr>
-          <w:trHeight w:val="537"/>
-        </w:trPr>
-        <w:tc>
-          <w:tcPr>
-            <w:tcW w:w="867" w:type="dxa"/>
-            <w:tcBorders>
-              <w:left w:val="single" w:sz="6" w:space="0" w:color="000000"/>
-              <w:bottom w:val="single" w:sz="4" w:space="0" w:color="auto"/>
-            </w:tcBorders>
-            <w:vAlign w:val="center"/>
-          </w:tcPr>
-          <w:p>
-            <w:pPr>
-              <w:pStyle w:val="TableParagraph"/>
-              <w:spacing w:before="134"/>
-              <w:ind w:left="176" w:right="168"/>
-              <w:jc w:val="center"/>
-            </w:pPr>
-            <w:r>
-              <w:t xml:space="preserve">15.8</w:t>
+            <w:r>
+              <w:t>15.7</w:t>
             </w:r>
           </w:p>
         </w:tc>

</xml_diff>